<commit_message>
Modified Queen Cell Guide and added PDF's
</commit_message>
<xml_diff>
--- a/downloads/year-in-the-apiary-monthly-seasonal-strategy.docx
+++ b/downloads/year-in-the-apiary-monthly-seasonal-strategy.docx
@@ -2530,28 +2530,15 @@
         <w:ind w:left="-567" w:hanging="284"/>
       </w:pPr>
       <w:r>
-        <w:t xml:space="preserve">Watch for </w:t>
-      </w:r>
-      <w:proofErr w:type="gramStart"/>
-      <w:r>
-        <w:t xml:space="preserve">robbing </w:t>
+        <w:t xml:space="preserve">Watch for robbing </w:t>
       </w:r>
       <w:proofErr w:type="spellStart"/>
       <w:r>
         <w:t>behaviour</w:t>
       </w:r>
       <w:proofErr w:type="spellEnd"/>
-      <w:proofErr w:type="gramEnd"/>
-      <w:r>
-        <w:t xml:space="preserve">, especially towards weaker colonies or </w:t>
-      </w:r>
-      <w:proofErr w:type="gramStart"/>
-      <w:r>
-        <w:t>open feed</w:t>
-      </w:r>
-      <w:proofErr w:type="gramEnd"/>
-      <w:r>
-        <w:t xml:space="preserve"> sources.</w:t>
+      <w:r>
+        <w:t>, especially towards weaker colonies or open feed sources.</w:t>
       </w:r>
     </w:p>
     <w:p>
@@ -2852,15 +2839,7 @@
         <w:ind w:left="-567" w:hanging="284"/>
       </w:pPr>
       <w:r>
-        <w:t>Once supers are off</w:t>
-      </w:r>
-      <w:proofErr w:type="gramStart"/>
-      <w:r>
-        <w:t>, begin</w:t>
-      </w:r>
-      <w:proofErr w:type="gramEnd"/>
-      <w:r>
-        <w:t xml:space="preserve"> primary varroa treatments in line with current UK guidance and product labels.</w:t>
+        <w:t>Once supers are off, begin primary varroa treatments in line with current UK guidance and product labels.</w:t>
       </w:r>
     </w:p>
     <w:p>
@@ -2884,15 +2863,7 @@
         <w:ind w:left="-567" w:hanging="284"/>
       </w:pPr>
       <w:r>
-        <w:t xml:space="preserve">Start autumn feeding </w:t>
-      </w:r>
-      <w:proofErr w:type="gramStart"/>
-      <w:r>
-        <w:t>plan</w:t>
-      </w:r>
-      <w:proofErr w:type="gramEnd"/>
-      <w:r>
-        <w:t xml:space="preserve"> after treatments if stores are insufficient for winter.</w:t>
+        <w:t>Start autumn feeding plan after treatments if stores are insufficient for winter.</w:t>
       </w:r>
     </w:p>
     <w:p>
@@ -3855,15 +3826,7 @@
         <w:ind w:left="-567" w:hanging="284"/>
       </w:pPr>
       <w:r>
-        <w:t xml:space="preserve">Avoid opening hives unless </w:t>
-      </w:r>
-      <w:proofErr w:type="gramStart"/>
-      <w:r>
-        <w:t>absolutely necessary</w:t>
-      </w:r>
-      <w:proofErr w:type="gramEnd"/>
-      <w:r>
-        <w:t>; rely on external observations.</w:t>
+        <w:t>Avoid opening hives unless absolutely necessary; rely on external observations.</w:t>
       </w:r>
     </w:p>
     <w:p>
@@ -3875,15 +3838,7 @@
         <w:ind w:left="-567" w:hanging="284"/>
       </w:pPr>
       <w:r>
-        <w:t xml:space="preserve">Prepare for a mid-winter oxalic acid varroa treatment during a </w:t>
-      </w:r>
-      <w:proofErr w:type="gramStart"/>
-      <w:r>
-        <w:t>brood</w:t>
-      </w:r>
-      <w:proofErr w:type="gramEnd"/>
-      <w:r>
-        <w:t xml:space="preserve">-light or </w:t>
+        <w:t xml:space="preserve">Prepare for a mid-winter oxalic acid varroa treatment during a brood-light or </w:t>
       </w:r>
       <w:proofErr w:type="spellStart"/>
       <w:r>
@@ -4168,23 +4123,7 @@
         <w:ind w:left="-567" w:hanging="284"/>
       </w:pPr>
       <w:r>
-        <w:t xml:space="preserve">Deep </w:t>
-      </w:r>
-      <w:proofErr w:type="gramStart"/>
-      <w:r>
-        <w:t>winter;</w:t>
-      </w:r>
-      <w:proofErr w:type="gramEnd"/>
-      <w:r>
-        <w:t xml:space="preserve"> bees are usually in a tight cluster with limited or no </w:t>
-      </w:r>
-      <w:proofErr w:type="gramStart"/>
-      <w:r>
-        <w:t>brood</w:t>
-      </w:r>
-      <w:proofErr w:type="gramEnd"/>
-      <w:r>
-        <w:t xml:space="preserve"> in colder spells.</w:t>
+        <w:t>Deep winter; bees are usually in a tight cluster with limited or no brood in colder spells.</w:t>
       </w:r>
     </w:p>
     <w:p>
@@ -4196,15 +4135,7 @@
         <w:ind w:left="-567" w:hanging="284"/>
       </w:pPr>
       <w:r>
-        <w:t xml:space="preserve">If using oxalic acid, this is often the window for a single mid-winter treatment when colonies are </w:t>
-      </w:r>
-      <w:proofErr w:type="gramStart"/>
-      <w:r>
-        <w:t>brood-light</w:t>
-      </w:r>
-      <w:proofErr w:type="gramEnd"/>
-      <w:r>
-        <w:t xml:space="preserve"> (following current guidance).</w:t>
+        <w:t>If using oxalic acid, this is often the window for a single mid-winter treatment when colonies are brood-light (following current guidance).</w:t>
       </w:r>
     </w:p>
     <w:p>
@@ -5902,15 +5833,7 @@
         <w:ind w:left="-567" w:hanging="284"/>
       </w:pPr>
       <w:r>
-        <w:t xml:space="preserve">Risks: starting treatments or feeding too late, leaving colonies weak or </w:t>
-      </w:r>
-      <w:proofErr w:type="gramStart"/>
-      <w:r>
-        <w:t>under-supplied</w:t>
-      </w:r>
-      <w:proofErr w:type="gramEnd"/>
-      <w:r>
-        <w:t xml:space="preserve"> as temperatures fall.</w:t>
+        <w:t>Risks: starting treatments or feeding too late, leaving colonies weak or under-supplied as temperatures fall.</w:t>
       </w:r>
     </w:p>
     <w:p>

</xml_diff>